<commit_message>
Action Plan with tick boxes in the CRM; pack v1.1
- CRM: Action Plan page (tick to complete, due dates, overdue alerts, progress,
  one-click 30-day launch plan), synced like other registers
- Fee bands 12.5/15/17.5/20/22.5%; 90-day credit guarantee; check-ins at days 7/30/60/90
- Temporary clients: weekly invoicing on 7-day terms; lower-risk roles only
- Pack v1.1: Action Plan (docx and xlsx), Insurance Broker Brief, Candidate File
  Checklist; business plan and terms updated

Co-Authored-By: Claude Opus 5.5 <noreply@anthropic.com>
Claude-Session: https://claude.ai/code/session_01XByJMQfkaq2do2XmLu4Dhj
</commit_message>
<xml_diff>
--- a/documents/Haverton Recruitment/1 Start Here/Read Me First.docx
+++ b/documents/Haverton Recruitment/1 Start Here/Read Me First.docx
@@ -437,7 +437,7 @@
               <w:spacing w:after="40" w:line="270"/>
             </w:pPr>
             <w:r>
-              <w:t xml:space="preserve">Read Me First, Launch Checklist</w:t>
+              <w:t xml:space="preserve">Read Me First, Action Plan, Action Plan Tracker (spreadsheet), Launch Checklist</w:t>
             </w:r>
           </w:p>
         </w:tc>
@@ -463,7 +463,7 @@
               <w:spacing w:after="40" w:line="270"/>
             </w:pPr>
             <w:r>
-              <w:t xml:space="preserve">Knowing what to do, in order</w:t>
+              <w:t xml:space="preserve">Knowing what to do, in order, and ticking it off</w:t>
             </w:r>
           </w:p>
         </w:tc>
@@ -603,7 +603,7 @@
               <w:spacing w:after="40" w:line="270"/>
             </w:pPr>
             <w:r>
-              <w:t xml:space="preserve">Client Terms Of Business, Candidate Terms, Recruitment Privacy Notice, Data Protection Record</w:t>
+              <w:t xml:space="preserve">Client Terms Of Business, Candidate Terms, Recruitment Privacy Notice, Data Protection Record, Insurance Broker Brief</w:t>
             </w:r>
           </w:p>
         </w:tc>
@@ -693,7 +693,7 @@
               <w:spacing w:after="40" w:line="270"/>
             </w:pPr>
             <w:r>
-              <w:t xml:space="preserve">Candidate Registration Form, Consent To Represent, Client Vacancy Brief, Interview Scoring Sheet, Reference Request, Placement Check In Record</w:t>
+              <w:t xml:space="preserve">Candidate File Checklist, Candidate Registration Form, Consent To Represent, Client Vacancy Brief, Interview Scoring Sheet, Reference Request, Placement Check In Record</w:t>
             </w:r>
           </w:p>
         </w:tc>
@@ -911,7 +911,7 @@
         <w:pStyle w:val="Heading1"/>
       </w:pPr>
       <w:r>
-        <w:t xml:space="preserve">Start permanent recruitment: your first steps</w:t>
+        <w:t xml:space="preserve">Track your progress in three ways</w:t>
       </w:r>
     </w:p>
     <w:p>
@@ -921,6 +921,157 @@
           <w:ilvl w:val="0"/>
           <w:numId w:val="2"/>
         </w:numPr>
+        <w:spacing w:after="80" w:line="290"/>
+      </w:pPr>
+      <w:r>
+        <w:rPr>
+          <w:b/>
+          <w:bCs/>
+        </w:rPr>
+        <w:t xml:space="preserve">Haverton Operations → Action Plan</w:t>
+      </w:r>
+      <w:r>
+        <w:t xml:space="preserve"> (recommended): click </w:t>
+      </w:r>
+      <w:r>
+        <w:rPr>
+          <w:b/>
+          <w:bCs/>
+        </w:rPr>
+        <w:t xml:space="preserve">Load 30-day launch plan</w:t>
+      </w:r>
+      <w:r>
+        <w:t xml:space="preserve">, choose your start date, then tick each action as you finish it. Due dates, overdue alerts and your progress bar update automatically and sync to every device you sign in on.</w:t>
+      </w:r>
+    </w:p>
+    <w:p>
+      <w:pPr>
+        <w:pStyle w:val="ListParagraph"/>
+        <w:numPr>
+          <w:ilvl w:val="0"/>
+          <w:numId w:val="2"/>
+        </w:numPr>
+        <w:spacing w:after="80" w:line="290"/>
+      </w:pPr>
+      <w:r>
+        <w:rPr>
+          <w:b/>
+          <w:bCs/>
+        </w:rPr>
+        <w:t xml:space="preserve">Action Plan.docx</w:t>
+      </w:r>
+      <w:r>
+        <w:t xml:space="preserve">: the same plan to print and tick by hand.</w:t>
+      </w:r>
+    </w:p>
+    <w:p>
+      <w:pPr>
+        <w:pStyle w:val="ListParagraph"/>
+        <w:numPr>
+          <w:ilvl w:val="0"/>
+          <w:numId w:val="2"/>
+        </w:numPr>
+        <w:spacing w:after="80" w:line="290"/>
+      </w:pPr>
+      <w:r>
+        <w:rPr>
+          <w:b/>
+          <w:bCs/>
+        </w:rPr>
+        <w:t xml:space="preserve">Action Plan Tracker.xlsx</w:t>
+      </w:r>
+      <w:r>
+        <w:t xml:space="preserve">: the same plan as a spreadsheet with a status drop-down and automatic overdue flags.</w:t>
+      </w:r>
+    </w:p>
+    <w:p>
+      <w:pPr>
+        <w:pStyle w:val="Heading1"/>
+      </w:pPr>
+      <w:r>
+        <w:t xml:space="preserve">What changed in version 1.1</w:t>
+      </w:r>
+    </w:p>
+    <w:p>
+      <w:pPr>
+        <w:pStyle w:val="ListParagraph"/>
+        <w:numPr>
+          <w:ilvl w:val="0"/>
+          <w:numId w:val="2"/>
+        </w:numPr>
+        <w:spacing w:after="80" w:line="290"/>
+      </w:pPr>
+      <w:r>
+        <w:t xml:space="preserve">Fee bands: 12.5%, 15%, 17.5%, 20% (Registered Managers) and 22.5% (senior operations, quality and retained search).</w:t>
+      </w:r>
+    </w:p>
+    <w:p>
+      <w:pPr>
+        <w:pStyle w:val="ListParagraph"/>
+        <w:numPr>
+          <w:ilvl w:val="0"/>
+          <w:numId w:val="2"/>
+        </w:numPr>
+        <w:spacing w:after="80" w:line="290"/>
+      </w:pPr>
+      <w:r>
+        <w:t xml:space="preserve">Guarantee: free replacement in days 0 to 30; 50% credit in days 31 to 60; 25% credit in days 61 to 90.</w:t>
+      </w:r>
+    </w:p>
+    <w:p>
+      <w:pPr>
+        <w:pStyle w:val="ListParagraph"/>
+        <w:numPr>
+          <w:ilvl w:val="0"/>
+          <w:numId w:val="2"/>
+        </w:numPr>
+        <w:spacing w:after="80" w:line="290"/>
+      </w:pPr>
+      <w:r>
+        <w:t xml:space="preserve">Check-ins at days 7, 30, 60 and 90.</w:t>
+      </w:r>
+    </w:p>
+    <w:p>
+      <w:pPr>
+        <w:pStyle w:val="ListParagraph"/>
+        <w:numPr>
+          <w:ilvl w:val="0"/>
+          <w:numId w:val="2"/>
+        </w:numPr>
+        <w:spacing w:after="80" w:line="290"/>
+      </w:pPr>
+      <w:r>
+        <w:t xml:space="preserve">Temporary clients: weekly invoices on 7-day terms, separate night, weekend and bank holiday rates.</w:t>
+      </w:r>
+    </w:p>
+    <w:p>
+      <w:pPr>
+        <w:pStyle w:val="ListParagraph"/>
+        <w:numPr>
+          <w:ilvl w:val="0"/>
+          <w:numId w:val="2"/>
+        </w:numPr>
+        <w:spacing w:after="80" w:line="290"/>
+      </w:pPr>
+      <w:r>
+        <w:t xml:space="preserve">New: Action Plan, Insurance Broker Brief and Candidate File Checklist (no health questions before offer; no DBS certificate copies; bank details only for temporary workers).</w:t>
+      </w:r>
+    </w:p>
+    <w:p>
+      <w:pPr>
+        <w:pStyle w:val="Heading1"/>
+      </w:pPr>
+      <w:r>
+        <w:t xml:space="preserve">Start permanent recruitment: your first steps</w:t>
+      </w:r>
+    </w:p>
+    <w:p>
+      <w:pPr>
+        <w:pStyle w:val="ListParagraph"/>
+        <w:numPr>
+          <w:ilvl w:val="0"/>
+          <w:numId w:val="3"/>
+        </w:numPr>
         <w:spacing w:after="90" w:line="290"/>
       </w:pPr>
       <w:r>
@@ -962,7 +1113,7 @@
         <w:pStyle w:val="ListParagraph"/>
         <w:numPr>
           <w:ilvl w:val="0"/>
-          <w:numId w:val="2"/>
+          <w:numId w:val="3"/>
         </w:numPr>
         <w:spacing w:after="90" w:line="290"/>
       </w:pPr>
@@ -985,7 +1136,7 @@
         <w:pStyle w:val="ListParagraph"/>
         <w:numPr>
           <w:ilvl w:val="0"/>
-          <w:numId w:val="2"/>
+          <w:numId w:val="3"/>
         </w:numPr>
         <w:spacing w:after="90" w:line="290"/>
       </w:pPr>
@@ -1008,7 +1159,7 @@
         <w:pStyle w:val="ListParagraph"/>
         <w:numPr>
           <w:ilvl w:val="0"/>
-          <w:numId w:val="2"/>
+          <w:numId w:val="3"/>
         </w:numPr>
         <w:spacing w:after="90" w:line="290"/>
       </w:pPr>
@@ -1031,12 +1182,97 @@
         <w:pStyle w:val="ListParagraph"/>
         <w:numPr>
           <w:ilvl w:val="0"/>
-          <w:numId w:val="2"/>
+          <w:numId w:val="3"/>
         </w:numPr>
         <w:spacing w:after="90" w:line="290"/>
       </w:pPr>
       <w:r>
         <w:t xml:space="preserve">Put the privacy notice and a candidate registration route on the website Recruitment page.</w:t>
+      </w:r>
+    </w:p>
+    <w:p>
+      <w:pPr>
+        <w:pStyle w:val="ListParagraph"/>
+        <w:numPr>
+          <w:ilvl w:val="0"/>
+          <w:numId w:val="3"/>
+        </w:numPr>
+        <w:spacing w:after="90" w:line="290"/>
+      </w:pPr>
+      <w:r>
+        <w:t xml:space="preserve">Import your target providers and candidates into </w:t>
+      </w:r>
+      <w:r>
+        <w:rPr>
+          <w:b/>
+          <w:bCs/>
+        </w:rPr>
+        <w:t xml:space="preserve">Haverton Operations</w:t>
+      </w:r>
+      <w:r>
+        <w:t xml:space="preserve"> (Import CSV on each register).</w:t>
+      </w:r>
+    </w:p>
+    <w:p>
+      <w:pPr>
+        <w:pStyle w:val="ListParagraph"/>
+        <w:numPr>
+          <w:ilvl w:val="0"/>
+          <w:numId w:val="3"/>
+        </w:numPr>
+        <w:spacing w:after="90" w:line="290"/>
+      </w:pPr>
+      <w:r>
+        <w:t xml:space="preserve">Start the weekly routine: 20 target providers, 10 to 15 emails, 15 to 20 calls, 3 discovery meetings. Use the Sales templates.</w:t>
+      </w:r>
+    </w:p>
+    <w:p>
+      <w:pPr>
+        <w:pStyle w:val="ListParagraph"/>
+        <w:numPr>
+          <w:ilvl w:val="0"/>
+          <w:numId w:val="3"/>
+        </w:numPr>
+        <w:spacing w:after="90" w:line="290"/>
+      </w:pPr>
+      <w:r>
+        <w:t xml:space="preserve">For every vacancy: signed terms, completed Vacancy Brief, then search. For every candidate: registration, then consent before any CV is sent.</w:t>
+      </w:r>
+    </w:p>
+    <w:p>
+      <w:pPr>
+        <w:pStyle w:val="Heading1"/>
+      </w:pPr>
+      <w:r>
+        <w:t xml:space="preserve">Temporary staffing: what we can do now</w:t>
+      </w:r>
+    </w:p>
+    <w:p>
+      <w:pPr>
+        <w:spacing w:after="140" w:line="300"/>
+      </w:pPr>
+      <w:r>
+        <w:t xml:space="preserve">You asked to start both. Permanent recruitment can start as soon as the steps above are done. Temporary staffing can be </w:t>
+      </w:r>
+      <w:r>
+        <w:rPr>
+          <w:b/>
+          <w:bCs/>
+        </w:rPr>
+        <w:t xml:space="preserve">prepared</w:t>
+      </w:r>
+      <w:r>
+        <w:t xml:space="preserve"> now but must not </w:t>
+      </w:r>
+      <w:r>
+        <w:rPr>
+          <w:b/>
+          <w:bCs/>
+        </w:rPr>
+        <w:t xml:space="preserve">start</w:t>
+      </w:r>
+      <w:r>
+        <w:t xml:space="preserve"> until the Go Live Gate is complete, because it makes Haverton the employer of the workers, with payroll, pension, holiday pay, insurance and cash-flow duties.</w:t>
       </w:r>
     </w:p>
     <w:p>
@@ -1046,20 +1282,17 @@
           <w:ilvl w:val="0"/>
           <w:numId w:val="2"/>
         </w:numPr>
-        <w:spacing w:after="90" w:line="290"/>
-      </w:pPr>
-      <w:r>
-        <w:t xml:space="preserve">Import your target providers and candidates into </w:t>
-      </w:r>
+        <w:spacing w:after="80" w:line="290"/>
+      </w:pPr>
       <w:r>
         <w:rPr>
           <w:b/>
           <w:bCs/>
         </w:rPr>
-        <w:t xml:space="preserve">Haverton Operations</w:t>
-      </w:r>
-      <w:r>
-        <w:t xml:space="preserve"> (Import CSV on each register).</w:t>
+        <w:t xml:space="preserve">Now:</w:t>
+      </w:r>
+      <w:r>
+        <w:t xml:space="preserve"> ask your accountant about payroll and a 13-week cash-flow forecast; get quotes for employment business and employers’ liability insurance; send the temporary drafts to the solicitor with the permanent documents to save cost.</w:t>
       </w:r>
     </w:p>
     <w:p>
@@ -1069,88 +1302,6 @@
           <w:ilvl w:val="0"/>
           <w:numId w:val="2"/>
         </w:numPr>
-        <w:spacing w:after="90" w:line="290"/>
-      </w:pPr>
-      <w:r>
-        <w:t xml:space="preserve">Start the weekly routine: 20 target providers, 10 to 15 emails, 15 to 20 calls, 3 discovery meetings. Use the Sales templates.</w:t>
-      </w:r>
-    </w:p>
-    <w:p>
-      <w:pPr>
-        <w:pStyle w:val="ListParagraph"/>
-        <w:numPr>
-          <w:ilvl w:val="0"/>
-          <w:numId w:val="2"/>
-        </w:numPr>
-        <w:spacing w:after="90" w:line="290"/>
-      </w:pPr>
-      <w:r>
-        <w:t xml:space="preserve">For every vacancy: signed terms, completed Vacancy Brief, then search. For every candidate: registration, then consent before any CV is sent.</w:t>
-      </w:r>
-    </w:p>
-    <w:p>
-      <w:pPr>
-        <w:pStyle w:val="Heading1"/>
-      </w:pPr>
-      <w:r>
-        <w:t xml:space="preserve">Temporary staffing: what we can do now</w:t>
-      </w:r>
-    </w:p>
-    <w:p>
-      <w:pPr>
-        <w:spacing w:after="140" w:line="300"/>
-      </w:pPr>
-      <w:r>
-        <w:t xml:space="preserve">You asked to start both. Permanent recruitment can start as soon as the steps above are done. Temporary staffing can be </w:t>
-      </w:r>
-      <w:r>
-        <w:rPr>
-          <w:b/>
-          <w:bCs/>
-        </w:rPr>
-        <w:t xml:space="preserve">prepared</w:t>
-      </w:r>
-      <w:r>
-        <w:t xml:space="preserve"> now but must not </w:t>
-      </w:r>
-      <w:r>
-        <w:rPr>
-          <w:b/>
-          <w:bCs/>
-        </w:rPr>
-        <w:t xml:space="preserve">start</w:t>
-      </w:r>
-      <w:r>
-        <w:t xml:space="preserve"> until the Go Live Gate is complete, because it makes Haverton the employer of the workers, with payroll, pension, holiday pay, insurance and cash-flow duties.</w:t>
-      </w:r>
-    </w:p>
-    <w:p>
-      <w:pPr>
-        <w:pStyle w:val="ListParagraph"/>
-        <w:numPr>
-          <w:ilvl w:val="0"/>
-          <w:numId w:val="3"/>
-        </w:numPr>
-        <w:spacing w:after="80" w:line="290"/>
-      </w:pPr>
-      <w:r>
-        <w:rPr>
-          <w:b/>
-          <w:bCs/>
-        </w:rPr>
-        <w:t xml:space="preserve">Now:</w:t>
-      </w:r>
-      <w:r>
-        <w:t xml:space="preserve"> ask your accountant about payroll and a 13-week cash-flow forecast; get quotes for employment business and employers’ liability insurance; send the temporary drafts to the solicitor with the permanent documents to save cost.</w:t>
-      </w:r>
-    </w:p>
-    <w:p>
-      <w:pPr>
-        <w:pStyle w:val="ListParagraph"/>
-        <w:numPr>
-          <w:ilvl w:val="0"/>
-          <w:numId w:val="3"/>
-        </w:numPr>
         <w:spacing w:after="80" w:line="290"/>
       </w:pPr>
       <w:r>
@@ -1169,7 +1320,7 @@
         <w:pStyle w:val="ListParagraph"/>
         <w:numPr>
           <w:ilvl w:val="0"/>
-          <w:numId w:val="3"/>
+          <w:numId w:val="2"/>
         </w:numPr>
         <w:spacing w:after="80" w:line="290"/>
       </w:pPr>
@@ -1809,7 +1960,7 @@
         <w:sz w:val="16"/>
         <w:szCs w:val="16"/>
       </w:rPr>
-      <w:t xml:space="preserve">Version 1.0 | September 2026 | Page </w:t>
+      <w:t xml:space="preserve">Version 1.1 | September 2026 | Page </w:t>
     </w:r>
     <w:r>
       <w:rPr>
@@ -2041,13 +2192,13 @@
     </w:lvlOverride>
   </w:num>
   <w:num w:numId="2">
-    <w:abstractNumId w:val="3"/>
+    <w:abstractNumId w:val="2"/>
     <w:lvlOverride w:ilvl="0">
       <w:startOverride w:val="1"/>
     </w:lvlOverride>
   </w:num>
   <w:num w:numId="3">
-    <w:abstractNumId w:val="2"/>
+    <w:abstractNumId w:val="3"/>
     <w:lvlOverride w:ilvl="0">
       <w:startOverride w:val="1"/>
     </w:lvlOverride>

</xml_diff>

<commit_message>
Launch kit: target providers from CQC directory, CRM import files, job adverts, recruitment page, temporary cash flow
Co-Authored-By: Claude Opus 5.5 <noreply@anthropic.com>
Claude-Session: https://claude.ai/code/session_01XByJMQfkaq2do2XmLu4Dhj
</commit_message>
<xml_diff>
--- a/documents/Haverton Recruitment/1 Start Here/Read Me First.docx
+++ b/documents/Haverton Recruitment/1 Start Here/Read Me First.docx
@@ -900,6 +900,89 @@
           </w:p>
         </w:tc>
       </w:tr>
+      <w:tr>
+        <w:trPr>
+          <w:cantSplit/>
+        </w:trPr>
+        <w:tc>
+          <w:tcPr>
+            <w:tcW w:type="dxa" w:w="1927"/>
+            <w:tcBorders>
+              <w:top w:val="single" w:color="D9D2C3" w:sz="4"/>
+              <w:left w:val="single" w:color="D9D2C3" w:sz="4"/>
+              <w:bottom w:val="single" w:color="D9D2C3" w:sz="4"/>
+              <w:right w:val="single" w:color="D9D2C3" w:sz="4"/>
+            </w:tcBorders>
+            <w:tcMar>
+              <w:top w:type="dxa" w:w="80"/>
+              <w:left w:type="dxa" w:w="110"/>
+              <w:bottom w:type="dxa" w:w="80"/>
+              <w:right w:type="dxa" w:w="110"/>
+            </w:tcMar>
+            <w:vAlign w:val="top"/>
+          </w:tcPr>
+          <w:p>
+            <w:pPr>
+              <w:spacing w:after="40" w:line="270"/>
+            </w:pPr>
+            <w:r>
+              <w:t xml:space="preserve">7 Launch Kit</w:t>
+            </w:r>
+          </w:p>
+        </w:tc>
+        <w:tc>
+          <w:tcPr>
+            <w:tcW w:type="dxa" w:w="3855"/>
+            <w:tcBorders>
+              <w:top w:val="single" w:color="D9D2C3" w:sz="4"/>
+              <w:left w:val="single" w:color="D9D2C3" w:sz="4"/>
+              <w:bottom w:val="single" w:color="D9D2C3" w:sz="4"/>
+              <w:right w:val="single" w:color="D9D2C3" w:sz="4"/>
+            </w:tcBorders>
+            <w:tcMar>
+              <w:top w:type="dxa" w:w="80"/>
+              <w:left w:type="dxa" w:w="110"/>
+              <w:bottom w:type="dxa" w:w="80"/>
+              <w:right w:type="dxa" w:w="110"/>
+            </w:tcMar>
+            <w:vAlign w:val="top"/>
+          </w:tcPr>
+          <w:p>
+            <w:pPr>
+              <w:spacing w:after="40" w:line="270"/>
+            </w:pPr>
+            <w:r>
+              <w:t xml:space="preserve">Target Providers (spreadsheet), Target Providers Import, Candidates Import Template, Job Adverts, Recruitment Page, Temporary Staffing Cash Flow (spreadsheet)</w:t>
+            </w:r>
+          </w:p>
+        </w:tc>
+        <w:tc>
+          <w:tcPr>
+            <w:tcW w:type="dxa" w:w="3856"/>
+            <w:tcBorders>
+              <w:top w:val="single" w:color="D9D2C3" w:sz="4"/>
+              <w:left w:val="single" w:color="D9D2C3" w:sz="4"/>
+              <w:bottom w:val="single" w:color="D9D2C3" w:sz="4"/>
+              <w:right w:val="single" w:color="D9D2C3" w:sz="4"/>
+            </w:tcBorders>
+            <w:tcMar>
+              <w:top w:type="dxa" w:w="80"/>
+              <w:left w:type="dxa" w:w="110"/>
+              <w:bottom w:type="dxa" w:w="80"/>
+              <w:right w:type="dxa" w:w="110"/>
+            </w:tcMar>
+            <w:vAlign w:val="top"/>
+          </w:tcPr>
+          <w:p>
+            <w:pPr>
+              <w:spacing w:after="40" w:line="270"/>
+            </w:pPr>
+            <w:r>
+              <w:t xml:space="preserve">Starting now: who to contact, adverts to post, website wording, and the cash you need for temporary staffing</w:t>
+            </w:r>
+          </w:p>
+        </w:tc>
+      </w:tr>
     </w:tbl>
     <w:p>
       <w:pPr>
@@ -1200,17 +1283,17 @@
         <w:spacing w:after="90" w:line="290"/>
       </w:pPr>
       <w:r>
-        <w:t xml:space="preserve">Import your target providers and candidates into </w:t>
+        <w:t xml:space="preserve">Import </w:t>
       </w:r>
       <w:r>
         <w:rPr>
           <w:b/>
           <w:bCs/>
         </w:rPr>
-        <w:t xml:space="preserve">Haverton Operations</w:t>
-      </w:r>
-      <w:r>
-        <w:t xml:space="preserve"> (Import CSV on each register).</w:t>
+        <w:t xml:space="preserve">7 Launch Kit/Target Providers Import.csv</w:t>
+      </w:r>
+      <w:r>
+        <w:t xml:space="preserve"> into Haverton Operations (Clients, Import CSV): 442 CQC-registered services in your priority area, ready to contact.</w:t>
       </w:r>
     </w:p>
     <w:p>

</xml_diff>

<commit_message>
Update pack contents table to list folders 9-12
Add rows for Social Media, Finance Tool, Family Guide and Payroll
Calculator to the 'What is in this pack' table in Read Me First, so the
index matches the folders actually in the pack.

Co-Authored-By: Claude Opus 4.8 <noreply@anthropic.com>
Claude-Session: https://claude.ai/code/session_01XByJMQfkaq2do2XmLu4Dhj
</commit_message>
<xml_diff>
--- a/documents/Haverton Recruitment/1 Start Here/Read Me First.docx
+++ b/documents/Haverton Recruitment/1 Start Here/Read Me First.docx
@@ -1062,6 +1062,338 @@
             </w:pPr>
             <w:r>
               <w:t xml:space="preserve">Your first week of calls and emails, and every step from first call to first paid invoice</w:t>
+            </w:r>
+          </w:p>
+        </w:tc>
+      </w:tr>
+      <w:tr>
+        <w:trPr>
+          <w:cantSplit/>
+        </w:trPr>
+        <w:tc>
+          <w:tcPr>
+            <w:tcW w:type="dxa" w:w="1927"/>
+            <w:tcBorders>
+              <w:top w:val="single" w:color="D9D2C3" w:sz="4"/>
+              <w:left w:val="single" w:color="D9D2C3" w:sz="4"/>
+              <w:bottom w:val="single" w:color="D9D2C3" w:sz="4"/>
+              <w:right w:val="single" w:color="D9D2C3" w:sz="4"/>
+            </w:tcBorders>
+            <w:tcMar>
+              <w:top w:type="dxa" w:w="80"/>
+              <w:left w:type="dxa" w:w="110"/>
+              <w:bottom w:type="dxa" w:w="80"/>
+              <w:right w:type="dxa" w:w="110"/>
+            </w:tcMar>
+            <w:vAlign w:val="top"/>
+          </w:tcPr>
+          <w:p>
+            <w:pPr>
+              <w:spacing w:after="40" w:line="270"/>
+            </w:pPr>
+            <w:r>
+              <w:t xml:space="preserve">9 Social Media</w:t>
+            </w:r>
+          </w:p>
+        </w:tc>
+        <w:tc>
+          <w:tcPr>
+            <w:tcW w:type="dxa" w:w="3855"/>
+            <w:tcBorders>
+              <w:top w:val="single" w:color="D9D2C3" w:sz="4"/>
+              <w:left w:val="single" w:color="D9D2C3" w:sz="4"/>
+              <w:bottom w:val="single" w:color="D9D2C3" w:sz="4"/>
+              <w:right w:val="single" w:color="D9D2C3" w:sz="4"/>
+            </w:tcBorders>
+            <w:tcMar>
+              <w:top w:type="dxa" w:w="80"/>
+              <w:left w:type="dxa" w:w="110"/>
+              <w:bottom w:type="dxa" w:w="80"/>
+              <w:right w:type="dxa" w:w="110"/>
+            </w:tcMar>
+            <w:vAlign w:val="top"/>
+          </w:tcPr>
+          <w:p>
+            <w:pPr>
+              <w:spacing w:after="40" w:line="270"/>
+            </w:pPr>
+            <w:r>
+              <w:t xml:space="preserve">Logos, cover and profile images, 8 ready-to-post graphics, Instagram highlight covers, Social Media Plan, Profile and Bio Copy</w:t>
+            </w:r>
+          </w:p>
+        </w:tc>
+        <w:tc>
+          <w:tcPr>
+            <w:tcW w:type="dxa" w:w="3856"/>
+            <w:tcBorders>
+              <w:top w:val="single" w:color="D9D2C3" w:sz="4"/>
+              <w:left w:val="single" w:color="D9D2C3" w:sz="4"/>
+              <w:bottom w:val="single" w:color="D9D2C3" w:sz="4"/>
+              <w:right w:val="single" w:color="D9D2C3" w:sz="4"/>
+            </w:tcBorders>
+            <w:tcMar>
+              <w:top w:type="dxa" w:w="80"/>
+              <w:left w:type="dxa" w:w="110"/>
+              <w:bottom w:type="dxa" w:w="80"/>
+              <w:right w:type="dxa" w:w="110"/>
+            </w:tcMar>
+            <w:vAlign w:val="top"/>
+          </w:tcPr>
+          <w:p>
+            <w:pPr>
+              <w:spacing w:after="40" w:line="270"/>
+            </w:pPr>
+            <w:r>
+              <w:t xml:space="preserve">Launching and posting on Facebook, LinkedIn and Instagram</w:t>
+            </w:r>
+          </w:p>
+        </w:tc>
+      </w:tr>
+      <w:tr>
+        <w:trPr>
+          <w:cantSplit/>
+        </w:trPr>
+        <w:tc>
+          <w:tcPr>
+            <w:tcW w:type="dxa" w:w="1927"/>
+            <w:tcBorders>
+              <w:top w:val="single" w:color="D9D2C3" w:sz="4"/>
+              <w:left w:val="single" w:color="D9D2C3" w:sz="4"/>
+              <w:bottom w:val="single" w:color="D9D2C3" w:sz="4"/>
+              <w:right w:val="single" w:color="D9D2C3" w:sz="4"/>
+            </w:tcBorders>
+            <w:tcMar>
+              <w:top w:type="dxa" w:w="80"/>
+              <w:left w:type="dxa" w:w="110"/>
+              <w:bottom w:type="dxa" w:w="80"/>
+              <w:right w:type="dxa" w:w="110"/>
+            </w:tcMar>
+            <w:vAlign w:val="top"/>
+          </w:tcPr>
+          <w:p>
+            <w:pPr>
+              <w:spacing w:after="40" w:line="270"/>
+            </w:pPr>
+            <w:r>
+              <w:t xml:space="preserve">10 Finance Tool</w:t>
+            </w:r>
+          </w:p>
+        </w:tc>
+        <w:tc>
+          <w:tcPr>
+            <w:tcW w:type="dxa" w:w="3855"/>
+            <w:tcBorders>
+              <w:top w:val="single" w:color="D9D2C3" w:sz="4"/>
+              <w:left w:val="single" w:color="D9D2C3" w:sz="4"/>
+              <w:bottom w:val="single" w:color="D9D2C3" w:sz="4"/>
+              <w:right w:val="single" w:color="D9D2C3" w:sz="4"/>
+            </w:tcBorders>
+            <w:tcMar>
+              <w:top w:type="dxa" w:w="80"/>
+              <w:left w:type="dxa" w:w="110"/>
+              <w:bottom w:type="dxa" w:w="80"/>
+              <w:right w:type="dxa" w:w="110"/>
+            </w:tcMar>
+            <w:vAlign w:val="top"/>
+          </w:tcPr>
+          <w:p>
+            <w:pPr>
+              <w:spacing w:after="40" w:line="270"/>
+            </w:pPr>
+            <w:r>
+              <w:t xml:space="preserve">Haverton Finance Tool (offline web page), Read Me</w:t>
+            </w:r>
+          </w:p>
+        </w:tc>
+        <w:tc>
+          <w:tcPr>
+            <w:tcW w:type="dxa" w:w="3856"/>
+            <w:tcBorders>
+              <w:top w:val="single" w:color="D9D2C3" w:sz="4"/>
+              <w:left w:val="single" w:color="D9D2C3" w:sz="4"/>
+              <w:bottom w:val="single" w:color="D9D2C3" w:sz="4"/>
+              <w:right w:val="single" w:color="D9D2C3" w:sz="4"/>
+            </w:tcBorders>
+            <w:tcMar>
+              <w:top w:type="dxa" w:w="80"/>
+              <w:left w:type="dxa" w:w="110"/>
+              <w:bottom w:type="dxa" w:w="80"/>
+              <w:right w:type="dxa" w:w="110"/>
+            </w:tcMar>
+            <w:vAlign w:val="top"/>
+          </w:tcPr>
+          <w:p>
+            <w:pPr>
+              <w:spacing w:after="40" w:line="270"/>
+            </w:pPr>
+            <w:r>
+              <w:t xml:space="preserve">Pricing care hours: the true cost of an hour and the charge rate you need, with pay rates and tax setup</w:t>
+            </w:r>
+          </w:p>
+        </w:tc>
+      </w:tr>
+      <w:tr>
+        <w:trPr>
+          <w:cantSplit/>
+        </w:trPr>
+        <w:tc>
+          <w:tcPr>
+            <w:tcW w:type="dxa" w:w="1927"/>
+            <w:tcBorders>
+              <w:top w:val="single" w:color="D9D2C3" w:sz="4"/>
+              <w:left w:val="single" w:color="D9D2C3" w:sz="4"/>
+              <w:bottom w:val="single" w:color="D9D2C3" w:sz="4"/>
+              <w:right w:val="single" w:color="D9D2C3" w:sz="4"/>
+            </w:tcBorders>
+            <w:tcMar>
+              <w:top w:type="dxa" w:w="80"/>
+              <w:left w:type="dxa" w:w="110"/>
+              <w:bottom w:type="dxa" w:w="80"/>
+              <w:right w:type="dxa" w:w="110"/>
+            </w:tcMar>
+            <w:vAlign w:val="top"/>
+          </w:tcPr>
+          <w:p>
+            <w:pPr>
+              <w:spacing w:after="40" w:line="270"/>
+            </w:pPr>
+            <w:r>
+              <w:t xml:space="preserve">11 Family Guide</w:t>
+            </w:r>
+          </w:p>
+        </w:tc>
+        <w:tc>
+          <w:tcPr>
+            <w:tcW w:type="dxa" w:w="3855"/>
+            <w:tcBorders>
+              <w:top w:val="single" w:color="D9D2C3" w:sz="4"/>
+              <w:left w:val="single" w:color="D9D2C3" w:sz="4"/>
+              <w:bottom w:val="single" w:color="D9D2C3" w:sz="4"/>
+              <w:right w:val="single" w:color="D9D2C3" w:sz="4"/>
+            </w:tcBorders>
+            <w:tcMar>
+              <w:top w:type="dxa" w:w="80"/>
+              <w:left w:type="dxa" w:w="110"/>
+              <w:bottom w:type="dxa" w:w="80"/>
+              <w:right w:type="dxa" w:w="110"/>
+            </w:tcMar>
+            <w:vAlign w:val="top"/>
+          </w:tcPr>
+          <w:p>
+            <w:pPr>
+              <w:spacing w:after="40" w:line="270"/>
+            </w:pPr>
+            <w:r>
+              <w:t xml:space="preserve">Understanding The Cost Of Care At Home (web page) and an embed version for the website</w:t>
+            </w:r>
+          </w:p>
+        </w:tc>
+        <w:tc>
+          <w:tcPr>
+            <w:tcW w:type="dxa" w:w="3856"/>
+            <w:tcBorders>
+              <w:top w:val="single" w:color="D9D2C3" w:sz="4"/>
+              <w:left w:val="single" w:color="D9D2C3" w:sz="4"/>
+              <w:bottom w:val="single" w:color="D9D2C3" w:sz="4"/>
+              <w:right w:val="single" w:color="D9D2C3" w:sz="4"/>
+            </w:tcBorders>
+            <w:tcMar>
+              <w:top w:type="dxa" w:w="80"/>
+              <w:left w:type="dxa" w:w="110"/>
+              <w:bottom w:type="dxa" w:w="80"/>
+              <w:right w:type="dxa" w:w="110"/>
+            </w:tcMar>
+            <w:vAlign w:val="top"/>
+          </w:tcPr>
+          <w:p>
+            <w:pPr>
+              <w:spacing w:after="40" w:line="270"/>
+            </w:pPr>
+            <w:r>
+              <w:t xml:space="preserve">A plain-English guide for families on paying for care at home, to publish or share</w:t>
+            </w:r>
+          </w:p>
+        </w:tc>
+      </w:tr>
+      <w:tr>
+        <w:trPr>
+          <w:cantSplit/>
+        </w:trPr>
+        <w:tc>
+          <w:tcPr>
+            <w:tcW w:type="dxa" w:w="1927"/>
+            <w:tcBorders>
+              <w:top w:val="single" w:color="D9D2C3" w:sz="4"/>
+              <w:left w:val="single" w:color="D9D2C3" w:sz="4"/>
+              <w:bottom w:val="single" w:color="D9D2C3" w:sz="4"/>
+              <w:right w:val="single" w:color="D9D2C3" w:sz="4"/>
+            </w:tcBorders>
+            <w:tcMar>
+              <w:top w:type="dxa" w:w="80"/>
+              <w:left w:type="dxa" w:w="110"/>
+              <w:bottom w:type="dxa" w:w="80"/>
+              <w:right w:type="dxa" w:w="110"/>
+            </w:tcMar>
+            <w:vAlign w:val="top"/>
+          </w:tcPr>
+          <w:p>
+            <w:pPr>
+              <w:spacing w:after="40" w:line="270"/>
+            </w:pPr>
+            <w:r>
+              <w:t xml:space="preserve">12 Payroll Calculator</w:t>
+            </w:r>
+          </w:p>
+        </w:tc>
+        <w:tc>
+          <w:tcPr>
+            <w:tcW w:type="dxa" w:w="3855"/>
+            <w:tcBorders>
+              <w:top w:val="single" w:color="D9D2C3" w:sz="4"/>
+              <w:left w:val="single" w:color="D9D2C3" w:sz="4"/>
+              <w:bottom w:val="single" w:color="D9D2C3" w:sz="4"/>
+              <w:right w:val="single" w:color="D9D2C3" w:sz="4"/>
+            </w:tcBorders>
+            <w:tcMar>
+              <w:top w:type="dxa" w:w="80"/>
+              <w:left w:type="dxa" w:w="110"/>
+              <w:bottom w:type="dxa" w:w="80"/>
+              <w:right w:type="dxa" w:w="110"/>
+            </w:tcMar>
+            <w:vAlign w:val="top"/>
+          </w:tcPr>
+          <w:p>
+            <w:pPr>
+              <w:spacing w:after="40" w:line="270"/>
+            </w:pPr>
+            <w:r>
+              <w:t xml:space="preserve">Haverton Payroll Calculator (offline web page), Read Me</w:t>
+            </w:r>
+          </w:p>
+        </w:tc>
+        <w:tc>
+          <w:tcPr>
+            <w:tcW w:type="dxa" w:w="3856"/>
+            <w:tcBorders>
+              <w:top w:val="single" w:color="D9D2C3" w:sz="4"/>
+              <w:left w:val="single" w:color="D9D2C3" w:sz="4"/>
+              <w:bottom w:val="single" w:color="D9D2C3" w:sz="4"/>
+              <w:right w:val="single" w:color="D9D2C3" w:sz="4"/>
+            </w:tcBorders>
+            <w:tcMar>
+              <w:top w:type="dxa" w:w="80"/>
+              <w:left w:type="dxa" w:w="110"/>
+              <w:bottom w:type="dxa" w:w="80"/>
+              <w:right w:type="dxa" w:w="110"/>
+            </w:tcMar>
+            <w:vAlign w:val="top"/>
+          </w:tcPr>
+          <w:p>
+            <w:pPr>
+              <w:spacing w:after="40" w:line="270"/>
+            </w:pPr>
+            <w:r>
+              <w:t xml:space="preserve">Take-home pay, employer costs, temporary-staffing margins and 2026/27 payroll rates</w:t>
             </w:r>
           </w:p>
         </w:tc>

</xml_diff>

<commit_message>
Bump pack Read Me First to version 1.2 with changelog
Update the footer to Version 1.2, October 2026, and add a 'What changed
in version 1.2' section covering the Finance Tool and Payroll Calculator,
the Social Media and Family Guide folders, the recruitment@ contact and
ICO registration, and the reorganised operations panel.

Co-Authored-By: Claude Opus 4.8 <noreply@anthropic.com>
Claude-Session: https://claude.ai/code/session_01XByJMQfkaq2do2XmLu4Dhj
</commit_message>
<xml_diff>
--- a/documents/Haverton Recruitment/1 Start Here/Read Me First.docx
+++ b/documents/Haverton Recruitment/1 Start Here/Read Me First.docx
@@ -1487,6 +1487,66 @@
         <w:pStyle w:val="Heading1"/>
       </w:pPr>
       <w:r>
+        <w:t xml:space="preserve">What changed in version 1.2</w:t>
+      </w:r>
+    </w:p>
+    <w:p>
+      <w:pPr>
+        <w:pStyle w:val="ListParagraph"/>
+        <w:numPr>
+          <w:ilvl w:val="0"/>
+          <w:numId w:val="2"/>
+        </w:numPr>
+        <w:spacing w:after="80" w:line="290"/>
+      </w:pPr>
+      <w:r>
+        <w:t xml:space="preserve">New online tools: a Finance Tool and a Payroll Calculator (take-home pay, employer costs, temporary-staffing margins and 2026/27 rates). Both work offline in this pack and inside Haverton Operations.</w:t>
+      </w:r>
+    </w:p>
+    <w:p>
+      <w:pPr>
+        <w:pStyle w:val="ListParagraph"/>
+        <w:numPr>
+          <w:ilvl w:val="0"/>
+          <w:numId w:val="2"/>
+        </w:numPr>
+        <w:spacing w:after="80" w:line="290"/>
+      </w:pPr>
+      <w:r>
+        <w:t xml:space="preserve">New in the pack: a Social Media folder (logos, ready-to-post graphics and a plan) and a Family Cost of Care Guide to publish or share.</w:t>
+      </w:r>
+    </w:p>
+    <w:p>
+      <w:pPr>
+        <w:pStyle w:val="ListParagraph"/>
+        <w:numPr>
+          <w:ilvl w:val="0"/>
+          <w:numId w:val="2"/>
+        </w:numPr>
+        <w:spacing w:after="80" w:line="290"/>
+      </w:pPr>
+      <w:r>
+        <w:t xml:space="preserve">Recruitment contact is now recruitment@havertoncare.co.uk; Haverton Care Limited is registered with the Information Commissioner's Office (ICO) as a data controller.</w:t>
+      </w:r>
+    </w:p>
+    <w:p>
+      <w:pPr>
+        <w:pStyle w:val="ListParagraph"/>
+        <w:numPr>
+          <w:ilvl w:val="0"/>
+          <w:numId w:val="2"/>
+        </w:numPr>
+        <w:spacing w:after="80" w:line="290"/>
+      </w:pPr>
+      <w:r>
+        <w:t xml:space="preserve">Operations side panel reorganised with quick links to the Haverton websites, job boards and the official DBS services.</w:t>
+      </w:r>
+    </w:p>
+    <w:p>
+      <w:pPr>
+        <w:pStyle w:val="Heading1"/>
+      </w:pPr>
+      <w:r>
         <w:t xml:space="preserve">What changed in version 1.1</w:t>
       </w:r>
     </w:p>
@@ -2458,7 +2518,7 @@
         <w:sz w:val="16"/>
         <w:szCs w:val="16"/>
       </w:rPr>
-      <w:t xml:space="preserve">Version 1.1 | September 2026 | Page </w:t>
+      <w:t xml:space="preserve">Version 1.2 | October 2026 | Page </w:t>
     </w:r>
     <w:r>
       <w:rPr>

</xml_diff>

<commit_message>
Add Payroll Setup Guide to the document pack
New 'Haverton Payroll Setup Guide.docx' in folder 12: registering as an
employer, choosing RTI software, onboarding, the pay-run routine,
paying HMRC, auto-enrolment, holiday/sick/family pay, year-end,
temporary staffing payroll, common mistakes, monitoring, costs and a
setup checklist. Read Me First (row 12 and v1.2 notes) and the folder
Read Me updated to list it.

Co-Authored-By: Claude Opus 5.5 <noreply@anthropic.com>
Claude-Session: https://claude.ai/code/session_01XByJMQfkaq2do2XmLu4Dhj
</commit_message>
<xml_diff>
--- a/documents/Haverton Recruitment/1 Start Here/Read Me First.docx
+++ b/documents/Haverton Recruitment/1 Start Here/Read Me First.docx
@@ -1367,7 +1367,7 @@
               <w:spacing w:after="40" w:line="270"/>
             </w:pPr>
             <w:r>
-              <w:t xml:space="preserve">Haverton Payroll Calculator (offline web page), Read Me</w:t>
+              <w:t xml:space="preserve">Haverton Payroll Calculator (offline web page), Payroll Setup Guide, Read Me</w:t>
             </w:r>
           </w:p>
         </w:tc>
@@ -1393,7 +1393,7 @@
               <w:spacing w:after="40" w:line="270"/>
             </w:pPr>
             <w:r>
-              <w:t xml:space="preserve">Take-home pay, employer costs, temporary-staffing margins and 2026/27 payroll rates</w:t>
+              <w:t xml:space="preserve">Take-home pay, employer costs, temporary-staffing margins and 2026/27 rates; how to set up and run real payroll</w:t>
             </w:r>
           </w:p>
         </w:tc>
@@ -1500,7 +1500,7 @@
         <w:spacing w:after="80" w:line="290"/>
       </w:pPr>
       <w:r>
-        <w:t xml:space="preserve">New online tools: a Finance Tool and a Payroll Calculator (take-home pay, employer costs, temporary-staffing margins and 2026/27 rates). Both work offline in this pack and inside Haverton Operations.</w:t>
+        <w:t xml:space="preserve">New online tools: a Finance Tool and a Payroll Calculator (take-home pay, employer costs, temporary-staffing margins and 2026/27 rates). Both work offline in this pack and inside Haverton Operations. A Payroll Setup Guide explains how to run real payroll.</w:t>
       </w:r>
     </w:p>
     <w:p>

</xml_diff>